<commit_message>
Funciones matemáticas Ackley y Griewank
</commit_message>
<xml_diff>
--- a/Commit 2 1.docx
+++ b/Commit 2 1.docx
@@ -3053,6 +3053,368 @@
           <w:lang w:val="es-ES"/>
         </w:rPr>
         <w:t xml:space="preserve"> (no significa nada letra por letra). El nombre viene del rugby, donde "scrum" (o "scrummage") se refiere a la formación en la que los jugadores de ambos equipos se agrupan y avanzan juntos hacia el balón, trabajando de forma coordinada.</w:t>
+      </w:r>
+    </w:p>
+    <w:p>
+      <w:pPr>
+        <w:pStyle w:val="Normal"/>
+        <w:jc w:val="left"/>
+        <w:rPr>
+          <w:rFonts w:ascii="Aptos" w:hAnsi="Aptos" w:eastAsia="Aptos" w:cs="Aptos"/>
+          <w:noProof w:val="0"/>
+          <w:sz w:val="40"/>
+          <w:szCs w:val="40"/>
+          <w:lang w:val="es-ES"/>
+        </w:rPr>
+      </w:pPr>
+    </w:p>
+    <w:p>
+      <w:pPr>
+        <w:pStyle w:val="Normal"/>
+        <w:jc w:val="left"/>
+        <w:rPr>
+          <w:rFonts w:ascii="Aptos" w:hAnsi="Aptos" w:eastAsia="Aptos" w:cs="Aptos"/>
+          <w:noProof w:val="0"/>
+          <w:sz w:val="40"/>
+          <w:szCs w:val="40"/>
+          <w:lang w:val="es-ES"/>
+        </w:rPr>
+      </w:pPr>
+    </w:p>
+    <w:p>
+      <w:pPr>
+        <w:pStyle w:val="Normal"/>
+        <w:jc w:val="left"/>
+        <w:rPr>
+          <w:rFonts w:ascii="Aptos" w:hAnsi="Aptos" w:eastAsia="Aptos" w:cs="Aptos"/>
+          <w:noProof w:val="0"/>
+          <w:sz w:val="40"/>
+          <w:szCs w:val="40"/>
+          <w:lang w:val="es-ES"/>
+        </w:rPr>
+      </w:pPr>
+    </w:p>
+    <w:p>
+      <w:pPr>
+        <w:pStyle w:val="Normal"/>
+        <w:jc w:val="left"/>
+        <w:rPr>
+          <w:rFonts w:ascii="Aptos" w:hAnsi="Aptos" w:eastAsia="Aptos" w:cs="Aptos"/>
+          <w:noProof w:val="0"/>
+          <w:sz w:val="40"/>
+          <w:szCs w:val="40"/>
+          <w:lang w:val="es-ES"/>
+        </w:rPr>
+      </w:pPr>
+    </w:p>
+    <w:p>
+      <w:pPr>
+        <w:pStyle w:val="Normal"/>
+        <w:jc w:val="left"/>
+        <w:rPr>
+          <w:rFonts w:ascii="Aptos" w:hAnsi="Aptos" w:eastAsia="Aptos" w:cs="Aptos"/>
+          <w:noProof w:val="0"/>
+          <w:sz w:val="40"/>
+          <w:szCs w:val="40"/>
+          <w:lang w:val="es-ES"/>
+        </w:rPr>
+      </w:pPr>
+    </w:p>
+    <w:p>
+      <w:pPr>
+        <w:pStyle w:val="Normal"/>
+        <w:jc w:val="left"/>
+        <w:rPr>
+          <w:rFonts w:ascii="Aptos" w:hAnsi="Aptos" w:eastAsia="Aptos" w:cs="Aptos"/>
+          <w:noProof w:val="0"/>
+          <w:sz w:val="40"/>
+          <w:szCs w:val="40"/>
+          <w:lang w:val="es-ES"/>
+        </w:rPr>
+      </w:pPr>
+    </w:p>
+    <w:p>
+      <w:pPr>
+        <w:pStyle w:val="Normal"/>
+        <w:jc w:val="left"/>
+        <w:rPr>
+          <w:rFonts w:ascii="Aptos" w:hAnsi="Aptos" w:eastAsia="Aptos" w:cs="Aptos"/>
+          <w:noProof w:val="0"/>
+          <w:sz w:val="40"/>
+          <w:szCs w:val="40"/>
+          <w:lang w:val="es-ES"/>
+        </w:rPr>
+      </w:pPr>
+    </w:p>
+    <w:p>
+      <w:pPr>
+        <w:pStyle w:val="Normal"/>
+        <w:jc w:val="left"/>
+        <w:rPr>
+          <w:rFonts w:ascii="Aptos" w:hAnsi="Aptos" w:eastAsia="Aptos" w:cs="Aptos"/>
+          <w:noProof w:val="0"/>
+          <w:sz w:val="40"/>
+          <w:szCs w:val="40"/>
+          <w:lang w:val="es-ES"/>
+        </w:rPr>
+      </w:pPr>
+    </w:p>
+    <w:p>
+      <w:pPr>
+        <w:pStyle w:val="Normal"/>
+        <w:jc w:val="left"/>
+        <w:rPr>
+          <w:rFonts w:ascii="Aptos" w:hAnsi="Aptos" w:eastAsia="Aptos" w:cs="Aptos"/>
+          <w:noProof w:val="0"/>
+          <w:sz w:val="40"/>
+          <w:szCs w:val="40"/>
+          <w:lang w:val="es-ES"/>
+        </w:rPr>
+      </w:pPr>
+    </w:p>
+    <w:p>
+      <w:pPr>
+        <w:pStyle w:val="Normal"/>
+        <w:jc w:val="left"/>
+      </w:pPr>
+      <w:r>
+        <w:rPr>
+          <w:rFonts w:ascii="Aptos" w:hAnsi="Aptos" w:eastAsia="Aptos" w:cs="Aptos"/>
+          <w:noProof w:val="0"/>
+          <w:sz w:val="40"/>
+          <w:szCs w:val="40"/>
+          <w:lang w:val="es-ES"/>
+        </w:rPr>
+        <w:t>El miércoles</w:t>
+      </w:r>
+    </w:p>
+    <w:p>
+      <w:pPr>
+        <w:pStyle w:val="Normal"/>
+        <w:jc w:val="left"/>
+      </w:pPr>
+      <w:r>
+        <w:rPr>
+          <w:rFonts w:ascii="Aptos" w:hAnsi="Aptos" w:eastAsia="Aptos" w:cs="Aptos"/>
+          <w:noProof w:val="0"/>
+          <w:sz w:val="40"/>
+          <w:szCs w:val="40"/>
+          <w:lang w:val="es-ES"/>
+        </w:rPr>
+        <w:t xml:space="preserve">Vimos de nuevo la función Ackley y resolvimos de nuevo las sumatorias, pero con una diferencia de dimensiones con un vector de 5 </w:t>
+      </w:r>
+      <w:r>
+        <w:rPr>
+          <w:rFonts w:ascii="Aptos" w:hAnsi="Aptos" w:eastAsia="Aptos" w:cs="Aptos"/>
+          <w:noProof w:val="0"/>
+          <w:sz w:val="40"/>
+          <w:szCs w:val="40"/>
+          <w:lang w:val="es-ES"/>
+        </w:rPr>
+        <w:t>dimensiones</w:t>
+      </w:r>
+      <w:r>
+        <w:rPr>
+          <w:rFonts w:ascii="Aptos" w:hAnsi="Aptos" w:eastAsia="Aptos" w:cs="Aptos"/>
+          <w:noProof w:val="0"/>
+          <w:sz w:val="40"/>
+          <w:szCs w:val="40"/>
+          <w:lang w:val="es-ES"/>
+        </w:rPr>
+        <w:t xml:space="preserve"> </w:t>
+      </w:r>
+      <w:r>
+        <w:rPr>
+          <w:rFonts w:ascii="Aptos" w:hAnsi="Aptos" w:eastAsia="Aptos" w:cs="Aptos"/>
+          <w:noProof w:val="0"/>
+          <w:sz w:val="40"/>
+          <w:szCs w:val="40"/>
+          <w:lang w:val="es-ES"/>
+        </w:rPr>
+        <w:t xml:space="preserve">pero con los mismos valores de </w:t>
+      </w:r>
+      <w:r>
+        <w:rPr>
+          <w:rFonts w:ascii="Aptos" w:hAnsi="Aptos" w:eastAsia="Aptos" w:cs="Aptos"/>
+          <w:noProof w:val="0"/>
+          <w:sz w:val="40"/>
+          <w:szCs w:val="40"/>
+          <w:lang w:val="es-ES"/>
+        </w:rPr>
+        <w:t>a,b</w:t>
+      </w:r>
+      <w:r>
+        <w:rPr>
+          <w:rFonts w:ascii="Aptos" w:hAnsi="Aptos" w:eastAsia="Aptos" w:cs="Aptos"/>
+          <w:noProof w:val="0"/>
+          <w:sz w:val="40"/>
+          <w:szCs w:val="40"/>
+          <w:lang w:val="es-ES"/>
+        </w:rPr>
+        <w:t xml:space="preserve"> y c</w:t>
+      </w:r>
+    </w:p>
+    <w:p>
+      <w:pPr>
+        <w:pStyle w:val="Normal"/>
+        <w:jc w:val="left"/>
+        <w:rPr>
+          <w:rFonts w:ascii="Aptos" w:hAnsi="Aptos" w:eastAsia="Aptos" w:cs="Aptos"/>
+          <w:noProof w:val="0"/>
+          <w:sz w:val="40"/>
+          <w:szCs w:val="40"/>
+          <w:lang w:val="es-ES"/>
+        </w:rPr>
+      </w:pPr>
+    </w:p>
+    <w:p>
+      <w:pPr>
+        <w:pStyle w:val="Normal"/>
+        <w:jc w:val="left"/>
+      </w:pPr>
+      <w:r>
+        <w:rPr>
+          <w:rFonts w:ascii="Aptos" w:hAnsi="Aptos" w:eastAsia="Aptos" w:cs="Aptos"/>
+          <w:noProof w:val="0"/>
+          <w:sz w:val="40"/>
+          <w:szCs w:val="40"/>
+          <w:lang w:val="es-ES"/>
+        </w:rPr>
+        <w:t xml:space="preserve">También vimos la función </w:t>
+      </w:r>
+      <w:r>
+        <w:rPr>
+          <w:rFonts w:ascii="Aptos" w:hAnsi="Aptos" w:eastAsia="Aptos" w:cs="Aptos"/>
+          <w:noProof w:val="0"/>
+          <w:sz w:val="40"/>
+          <w:szCs w:val="40"/>
+          <w:lang w:val="es-ES"/>
+        </w:rPr>
+        <w:t>Griewank</w:t>
+      </w:r>
+      <w:r>
+        <w:rPr>
+          <w:rFonts w:ascii="Aptos" w:hAnsi="Aptos" w:eastAsia="Aptos" w:cs="Aptos"/>
+          <w:noProof w:val="0"/>
+          <w:sz w:val="40"/>
+          <w:szCs w:val="40"/>
+          <w:lang w:val="es-ES"/>
+        </w:rPr>
+        <w:t xml:space="preserve"> </w:t>
+      </w:r>
+      <w:r>
+        <w:rPr>
+          <w:rFonts w:ascii="Aptos" w:hAnsi="Aptos" w:eastAsia="Aptos" w:cs="Aptos"/>
+          <w:noProof w:val="0"/>
+          <w:sz w:val="40"/>
+          <w:szCs w:val="40"/>
+          <w:lang w:val="es-ES"/>
+        </w:rPr>
+        <w:t xml:space="preserve">para probar y comparar algoritmos de optimización, especialmente algoritmos de </w:t>
+      </w:r>
+      <w:r>
+        <w:rPr>
+          <w:rFonts w:ascii="Aptos" w:hAnsi="Aptos" w:eastAsia="Aptos" w:cs="Aptos"/>
+          <w:b w:val="1"/>
+          <w:bCs w:val="1"/>
+          <w:noProof w:val="0"/>
+          <w:sz w:val="40"/>
+          <w:szCs w:val="40"/>
+          <w:lang w:val="es-ES"/>
+        </w:rPr>
+        <w:t>optimización global</w:t>
+      </w:r>
+      <w:r>
+        <w:rPr>
+          <w:rFonts w:ascii="Aptos" w:hAnsi="Aptos" w:eastAsia="Aptos" w:cs="Aptos"/>
+          <w:noProof w:val="0"/>
+          <w:sz w:val="40"/>
+          <w:szCs w:val="40"/>
+          <w:lang w:val="es-ES"/>
+        </w:rPr>
+        <w:t xml:space="preserve"> como algoritmos genéticos, PSO (</w:t>
+      </w:r>
+      <w:r>
+        <w:rPr>
+          <w:rFonts w:ascii="Aptos" w:hAnsi="Aptos" w:eastAsia="Aptos" w:cs="Aptos"/>
+          <w:noProof w:val="0"/>
+          <w:sz w:val="40"/>
+          <w:szCs w:val="40"/>
+          <w:lang w:val="es-ES"/>
+        </w:rPr>
+        <w:t>Particle</w:t>
+      </w:r>
+      <w:r>
+        <w:rPr>
+          <w:rFonts w:ascii="Aptos" w:hAnsi="Aptos" w:eastAsia="Aptos" w:cs="Aptos"/>
+          <w:noProof w:val="0"/>
+          <w:sz w:val="40"/>
+          <w:szCs w:val="40"/>
+          <w:lang w:val="es-ES"/>
+        </w:rPr>
+        <w:t xml:space="preserve"> Swarm </w:t>
+      </w:r>
+      <w:r>
+        <w:rPr>
+          <w:rFonts w:ascii="Aptos" w:hAnsi="Aptos" w:eastAsia="Aptos" w:cs="Aptos"/>
+          <w:noProof w:val="0"/>
+          <w:sz w:val="40"/>
+          <w:szCs w:val="40"/>
+          <w:lang w:val="es-ES"/>
+        </w:rPr>
+        <w:t>Optimization</w:t>
+      </w:r>
+      <w:r>
+        <w:rPr>
+          <w:rFonts w:ascii="Aptos" w:hAnsi="Aptos" w:eastAsia="Aptos" w:cs="Aptos"/>
+          <w:noProof w:val="0"/>
+          <w:sz w:val="40"/>
+          <w:szCs w:val="40"/>
+          <w:lang w:val="es-ES"/>
+        </w:rPr>
+        <w:t>), optimización</w:t>
+      </w:r>
+      <w:r>
+        <w:rPr>
+          <w:rFonts w:ascii="Aptos" w:hAnsi="Aptos" w:eastAsia="Aptos" w:cs="Aptos"/>
+          <w:noProof w:val="0"/>
+          <w:sz w:val="40"/>
+          <w:szCs w:val="40"/>
+          <w:lang w:val="es-ES"/>
+        </w:rPr>
+        <w:t xml:space="preserve"> Sirve para </w:t>
+      </w:r>
+      <w:r>
+        <w:rPr>
+          <w:rFonts w:ascii="Aptos" w:hAnsi="Aptos" w:eastAsia="Aptos" w:cs="Aptos"/>
+          <w:b w:val="1"/>
+          <w:bCs w:val="1"/>
+          <w:noProof w:val="0"/>
+          <w:sz w:val="40"/>
+          <w:szCs w:val="40"/>
+          <w:lang w:val="es-ES"/>
+        </w:rPr>
+        <w:t>evaluar qué tan bien funciona un algoritmo de optimización</w:t>
+      </w:r>
+      <w:r>
+        <w:rPr>
+          <w:rFonts w:ascii="Aptos" w:hAnsi="Aptos" w:eastAsia="Aptos" w:cs="Aptos"/>
+          <w:noProof w:val="0"/>
+          <w:sz w:val="40"/>
+          <w:szCs w:val="40"/>
+          <w:lang w:val="es-ES"/>
+        </w:rPr>
+        <w:t xml:space="preserve"> a la hora de encontrar el mínimo global de una función, especialmente cuando esa función es difícil de optimizar </w:t>
+      </w:r>
+      <w:r>
+        <w:rPr>
+          <w:rFonts w:ascii="Aptos" w:hAnsi="Aptos" w:eastAsia="Aptos" w:cs="Aptos"/>
+          <w:noProof w:val="0"/>
+          <w:sz w:val="40"/>
+          <w:szCs w:val="40"/>
+          <w:lang w:val="es-ES"/>
+        </w:rPr>
+        <w:t>por colonia de hormigas, entre otros.</w:t>
       </w:r>
     </w:p>
     <w:sectPr>

</xml_diff>

<commit_message>
Presentación clave de inteligencia artificial
</commit_message>
<xml_diff>
--- a/Commit 2 1.docx
+++ b/Commit 2 1.docx
@@ -3211,7 +3211,7 @@
           <w:szCs w:val="40"/>
           <w:lang w:val="es-ES"/>
         </w:rPr>
-        <w:t>dimensiones</w:t>
+        <w:t>dimensiones,</w:t>
       </w:r>
       <w:r>
         <w:rPr>
@@ -3415,6 +3415,167 @@
           <w:lang w:val="es-ES"/>
         </w:rPr>
         <w:t>por colonia de hormigas, entre otros.</w:t>
+      </w:r>
+    </w:p>
+    <w:p>
+      <w:pPr>
+        <w:pStyle w:val="Normal"/>
+        <w:jc w:val="left"/>
+        <w:rPr>
+          <w:rFonts w:ascii="Aptos" w:hAnsi="Aptos" w:eastAsia="Aptos" w:cs="Aptos"/>
+          <w:noProof w:val="0"/>
+          <w:sz w:val="40"/>
+          <w:szCs w:val="40"/>
+          <w:lang w:val="es-ES"/>
+        </w:rPr>
+      </w:pPr>
+    </w:p>
+    <w:p>
+      <w:pPr>
+        <w:pStyle w:val="Normal"/>
+        <w:jc w:val="left"/>
+        <w:rPr>
+          <w:rFonts w:ascii="Aptos" w:hAnsi="Aptos" w:eastAsia="Aptos" w:cs="Aptos"/>
+          <w:noProof w:val="0"/>
+          <w:sz w:val="40"/>
+          <w:szCs w:val="40"/>
+          <w:lang w:val="es-ES"/>
+        </w:rPr>
+      </w:pPr>
+    </w:p>
+    <w:p>
+      <w:pPr>
+        <w:pStyle w:val="Normal"/>
+        <w:jc w:val="left"/>
+        <w:rPr>
+          <w:rFonts w:ascii="Aptos" w:hAnsi="Aptos" w:eastAsia="Aptos" w:cs="Aptos"/>
+          <w:noProof w:val="0"/>
+          <w:sz w:val="40"/>
+          <w:szCs w:val="40"/>
+          <w:lang w:val="es-ES"/>
+        </w:rPr>
+      </w:pPr>
+    </w:p>
+    <w:p>
+      <w:pPr>
+        <w:pStyle w:val="Normal"/>
+        <w:jc w:val="left"/>
+        <w:rPr>
+          <w:rFonts w:ascii="Aptos" w:hAnsi="Aptos" w:eastAsia="Aptos" w:cs="Aptos"/>
+          <w:noProof w:val="0"/>
+          <w:sz w:val="40"/>
+          <w:szCs w:val="40"/>
+          <w:lang w:val="es-ES"/>
+        </w:rPr>
+      </w:pPr>
+    </w:p>
+    <w:p>
+      <w:pPr>
+        <w:pStyle w:val="Normal"/>
+        <w:jc w:val="left"/>
+        <w:rPr>
+          <w:rFonts w:ascii="Aptos" w:hAnsi="Aptos" w:eastAsia="Aptos" w:cs="Aptos"/>
+          <w:noProof w:val="0"/>
+          <w:sz w:val="40"/>
+          <w:szCs w:val="40"/>
+          <w:lang w:val="es-ES"/>
+        </w:rPr>
+      </w:pPr>
+    </w:p>
+    <w:p>
+      <w:pPr>
+        <w:pStyle w:val="Normal"/>
+        <w:jc w:val="left"/>
+        <w:rPr>
+          <w:rFonts w:ascii="Aptos" w:hAnsi="Aptos" w:eastAsia="Aptos" w:cs="Aptos"/>
+          <w:noProof w:val="0"/>
+          <w:sz w:val="40"/>
+          <w:szCs w:val="40"/>
+          <w:lang w:val="es-ES"/>
+        </w:rPr>
+      </w:pPr>
+    </w:p>
+    <w:p>
+      <w:pPr>
+        <w:pStyle w:val="Normal"/>
+        <w:jc w:val="left"/>
+        <w:rPr>
+          <w:rFonts w:ascii="Aptos" w:hAnsi="Aptos" w:eastAsia="Aptos" w:cs="Aptos"/>
+          <w:noProof w:val="0"/>
+          <w:sz w:val="40"/>
+          <w:szCs w:val="40"/>
+          <w:lang w:val="es-ES"/>
+        </w:rPr>
+      </w:pPr>
+      <w:r>
+        <w:rPr>
+          <w:rFonts w:ascii="Aptos" w:hAnsi="Aptos" w:eastAsia="Aptos" w:cs="Aptos"/>
+          <w:noProof w:val="0"/>
+          <w:sz w:val="40"/>
+          <w:szCs w:val="40"/>
+          <w:lang w:val="es-ES"/>
+        </w:rPr>
+        <w:t xml:space="preserve">El </w:t>
+      </w:r>
+      <w:r>
+        <w:rPr>
+          <w:rFonts w:ascii="Aptos" w:hAnsi="Aptos" w:eastAsia="Aptos" w:cs="Aptos"/>
+          <w:noProof w:val="0"/>
+          <w:sz w:val="40"/>
+          <w:szCs w:val="40"/>
+          <w:lang w:val="es-ES"/>
+        </w:rPr>
+        <w:t xml:space="preserve">jueves tuvimos </w:t>
+      </w:r>
+      <w:r>
+        <w:rPr>
+          <w:rFonts w:ascii="Aptos" w:hAnsi="Aptos" w:eastAsia="Aptos" w:cs="Aptos"/>
+          <w:noProof w:val="0"/>
+          <w:sz w:val="40"/>
+          <w:szCs w:val="40"/>
+          <w:lang w:val="es-ES"/>
+        </w:rPr>
+        <w:t>una presentación</w:t>
+      </w:r>
+      <w:r>
+        <w:rPr>
+          <w:rFonts w:ascii="Aptos" w:hAnsi="Aptos" w:eastAsia="Aptos" w:cs="Aptos"/>
+          <w:noProof w:val="0"/>
+          <w:sz w:val="40"/>
+          <w:szCs w:val="40"/>
+          <w:lang w:val="es-ES"/>
+        </w:rPr>
+        <w:t xml:space="preserve"> de alumnos que cursan cuarto año de la carrera ingeniería en sistemas y nos presentaron unas diapositivas sobre inteligencia </w:t>
+      </w:r>
+      <w:r>
+        <w:rPr>
+          <w:rFonts w:ascii="Aptos" w:hAnsi="Aptos" w:eastAsia="Aptos" w:cs="Aptos"/>
+          <w:noProof w:val="0"/>
+          <w:sz w:val="40"/>
+          <w:szCs w:val="40"/>
+          <w:lang w:val="es-ES"/>
+        </w:rPr>
+        <w:t>artificial, como funciona, como la hicieron, en base a que y porque decidieron hacerlo, las LLM son muy complejas y no es fáci</w:t>
+      </w:r>
+      <w:r>
+        <w:rPr>
+          <w:rFonts w:ascii="Aptos" w:hAnsi="Aptos" w:eastAsia="Aptos" w:cs="Aptos"/>
+          <w:noProof w:val="0"/>
+          <w:sz w:val="40"/>
+          <w:szCs w:val="40"/>
+          <w:lang w:val="es-ES"/>
+        </w:rPr>
+        <w:t>l crear una, es muchos bases de datos, textos, es un tema sin fin, hicimos preguntas que tuvieran que ver con las diapositivas y respondieron bien los alumnos</w:t>
+      </w:r>
+      <w:r>
+        <w:rPr>
+          <w:rFonts w:ascii="Aptos" w:hAnsi="Aptos" w:eastAsia="Aptos" w:cs="Aptos"/>
+          <w:noProof w:val="0"/>
+          <w:sz w:val="40"/>
+          <w:szCs w:val="40"/>
+          <w:lang w:val="es-ES"/>
+        </w:rPr>
+        <w:t>, esperó poder hacer una inteligencia artificial por mi cuenta o con compañeros para poder especializarla mucho y para personas de bajos recursos tanto económicos como en hardware.</w:t>
       </w:r>
     </w:p>
     <w:sectPr>

</xml_diff>